<commit_message>
Cleaned the original data in Pyspark and converted to Silver layer
</commit_message>
<xml_diff>
--- a/Pyspark with S3 Project Covid data transform bronze, silver, gold.docx
+++ b/Pyspark with S3 Project Covid data transform bronze, silver, gold.docx
@@ -470,6 +470,278 @@
       <w:proofErr w:type="spellEnd"/>
       <w:r>
         <w:t xml:space="preserve"> and Secret key</w:t>
+      </w:r>
+    </w:p>
+    <w:p/>
+    <w:p/>
+    <w:p>
+      <w:r>
+        <w:rPr>
+          <w:noProof/>
+        </w:rPr>
+        <w:lastRenderedPageBreak/>
+        <w:drawing>
+          <wp:inline distT="0" distB="0" distL="0" distR="0" wp14:anchorId="2C376D1B" wp14:editId="6561616C">
+            <wp:extent cx="5943600" cy="3618230"/>
+            <wp:effectExtent l="0" t="0" r="0" b="1270"/>
+            <wp:docPr id="121770034" name="Picture 3"/>
+            <wp:cNvGraphicFramePr>
+              <a:graphicFrameLocks xmlns:a="http://schemas.openxmlformats.org/drawingml/2006/main" noChangeAspect="1"/>
+            </wp:cNvGraphicFramePr>
+            <a:graphic xmlns:a="http://schemas.openxmlformats.org/drawingml/2006/main">
+              <a:graphicData uri="http://schemas.openxmlformats.org/drawingml/2006/picture">
+                <pic:pic xmlns:pic="http://schemas.openxmlformats.org/drawingml/2006/picture">
+                  <pic:nvPicPr>
+                    <pic:cNvPr id="0" name="Picture 5"/>
+                    <pic:cNvPicPr>
+                      <a:picLocks noChangeAspect="1" noChangeArrowheads="1"/>
+                    </pic:cNvPicPr>
+                  </pic:nvPicPr>
+                  <pic:blipFill>
+                    <a:blip r:embed="rId6">
+                      <a:extLst>
+                        <a:ext uri="{28A0092B-C50C-407E-A947-70E740481C1C}">
+                          <a14:useLocalDpi xmlns:a14="http://schemas.microsoft.com/office/drawing/2010/main" val="0"/>
+                        </a:ext>
+                      </a:extLst>
+                    </a:blip>
+                    <a:srcRect/>
+                    <a:stretch>
+                      <a:fillRect/>
+                    </a:stretch>
+                  </pic:blipFill>
+                  <pic:spPr bwMode="auto">
+                    <a:xfrm>
+                      <a:off x="0" y="0"/>
+                      <a:ext cx="5943600" cy="3618230"/>
+                    </a:xfrm>
+                    <a:prstGeom prst="rect">
+                      <a:avLst/>
+                    </a:prstGeom>
+                    <a:noFill/>
+                    <a:ln>
+                      <a:noFill/>
+                    </a:ln>
+                  </pic:spPr>
+                </pic:pic>
+              </a:graphicData>
+            </a:graphic>
+          </wp:inline>
+        </w:drawing>
+      </w:r>
+    </w:p>
+    <w:p/>
+    <w:p>
+      <w:pPr>
+        <w:rPr>
+          <w:b/>
+          <w:bCs/>
+          <w:sz w:val="28"/>
+          <w:szCs w:val="28"/>
+        </w:rPr>
+      </w:pPr>
+      <w:r>
+        <w:rPr>
+          <w:b/>
+          <w:bCs/>
+          <w:sz w:val="28"/>
+          <w:szCs w:val="28"/>
+        </w:rPr>
+        <w:t>Step</w:t>
+      </w:r>
+      <w:r>
+        <w:rPr>
+          <w:b/>
+          <w:bCs/>
+          <w:sz w:val="28"/>
+          <w:szCs w:val="28"/>
+        </w:rPr>
+        <w:t xml:space="preserve"> 2</w:t>
+      </w:r>
+      <w:proofErr w:type="gramStart"/>
+      <w:r>
+        <w:rPr>
+          <w:b/>
+          <w:bCs/>
+          <w:sz w:val="28"/>
+          <w:szCs w:val="28"/>
+        </w:rPr>
+        <w:t>:</w:t>
+      </w:r>
+      <w:r>
+        <w:rPr>
+          <w:b/>
+          <w:bCs/>
+          <w:sz w:val="28"/>
+          <w:szCs w:val="28"/>
+        </w:rPr>
+        <w:t xml:space="preserve">  Cleaned</w:t>
+      </w:r>
+      <w:proofErr w:type="gramEnd"/>
+      <w:r>
+        <w:rPr>
+          <w:b/>
+          <w:bCs/>
+          <w:sz w:val="28"/>
+          <w:szCs w:val="28"/>
+        </w:rPr>
+        <w:t xml:space="preserve"> the original data and converted to </w:t>
+      </w:r>
+      <w:proofErr w:type="gramStart"/>
+      <w:r>
+        <w:rPr>
+          <w:b/>
+          <w:bCs/>
+          <w:sz w:val="28"/>
+          <w:szCs w:val="28"/>
+        </w:rPr>
+        <w:t>Silver</w:t>
+      </w:r>
+      <w:proofErr w:type="gramEnd"/>
+      <w:r>
+        <w:rPr>
+          <w:b/>
+          <w:bCs/>
+          <w:sz w:val="28"/>
+          <w:szCs w:val="28"/>
+        </w:rPr>
+        <w:t xml:space="preserve"> layer</w:t>
+      </w:r>
+    </w:p>
+    <w:p>
+      <w:pPr>
+        <w:rPr>
+          <w:sz w:val="28"/>
+          <w:szCs w:val="28"/>
+        </w:rPr>
+      </w:pPr>
+      <w:r>
+        <w:rPr>
+          <w:sz w:val="28"/>
+          <w:szCs w:val="28"/>
+        </w:rPr>
+        <w:t xml:space="preserve">In previous step I loaded all three </w:t>
+      </w:r>
+      <w:proofErr w:type="spellStart"/>
+      <w:r>
+        <w:rPr>
+          <w:sz w:val="28"/>
+          <w:szCs w:val="28"/>
+        </w:rPr>
+        <w:t>cldata</w:t>
+      </w:r>
+      <w:proofErr w:type="spellEnd"/>
+      <w:r>
+        <w:rPr>
+          <w:sz w:val="28"/>
+          <w:szCs w:val="28"/>
+        </w:rPr>
+        <w:t xml:space="preserve"> sets from S3 to </w:t>
+      </w:r>
+      <w:proofErr w:type="spellStart"/>
+      <w:r>
+        <w:rPr>
+          <w:sz w:val="28"/>
+          <w:szCs w:val="28"/>
+        </w:rPr>
+        <w:t>Pyspark</w:t>
+      </w:r>
+      <w:proofErr w:type="spellEnd"/>
+      <w:r>
+        <w:rPr>
+          <w:sz w:val="28"/>
+          <w:szCs w:val="28"/>
+        </w:rPr>
+        <w:t>.</w:t>
+      </w:r>
+    </w:p>
+    <w:p>
+      <w:pPr>
+        <w:rPr>
+          <w:sz w:val="28"/>
+          <w:szCs w:val="28"/>
+        </w:rPr>
+      </w:pPr>
+      <w:r>
+        <w:rPr>
+          <w:sz w:val="28"/>
+          <w:szCs w:val="28"/>
+        </w:rPr>
+        <w:t xml:space="preserve">Then I cleaned it by </w:t>
+      </w:r>
+      <w:proofErr w:type="spellStart"/>
+      <w:r>
+        <w:rPr>
+          <w:sz w:val="28"/>
+          <w:szCs w:val="28"/>
+        </w:rPr>
+        <w:t>revoding</w:t>
+      </w:r>
+      <w:proofErr w:type="spellEnd"/>
+      <w:r>
+        <w:rPr>
+          <w:sz w:val="28"/>
+          <w:szCs w:val="28"/>
+        </w:rPr>
+        <w:t xml:space="preserve"> leading and trailing spaces from values in every column, removed completely duplicated rows, created cleaned data frames and left the original bronze files unchanged.</w:t>
+      </w:r>
+    </w:p>
+    <w:p>
+      <w:pPr>
+        <w:rPr>
+          <w:sz w:val="28"/>
+          <w:szCs w:val="28"/>
+        </w:rPr>
+      </w:pPr>
+      <w:proofErr w:type="gramStart"/>
+      <w:r>
+        <w:rPr>
+          <w:sz w:val="28"/>
+          <w:szCs w:val="28"/>
+        </w:rPr>
+        <w:t>Finally</w:t>
+      </w:r>
+      <w:proofErr w:type="gramEnd"/>
+      <w:r>
+        <w:rPr>
+          <w:sz w:val="28"/>
+          <w:szCs w:val="28"/>
+        </w:rPr>
+        <w:t xml:space="preserve"> I overwrote that cleaned data in Parque format instead of CSV. I mean transferred the cleaned data from </w:t>
+      </w:r>
+      <w:proofErr w:type="spellStart"/>
+      <w:r>
+        <w:rPr>
+          <w:sz w:val="28"/>
+          <w:szCs w:val="28"/>
+        </w:rPr>
+        <w:t>Pycharm</w:t>
+      </w:r>
+      <w:proofErr w:type="spellEnd"/>
+      <w:r>
+        <w:rPr>
+          <w:sz w:val="28"/>
+          <w:szCs w:val="28"/>
+        </w:rPr>
+        <w:t xml:space="preserve"> to S3 bucket. </w:t>
+      </w:r>
+      <w:proofErr w:type="spellStart"/>
+      <w:proofErr w:type="gramStart"/>
+      <w:r>
+        <w:rPr>
+          <w:sz w:val="28"/>
+          <w:szCs w:val="28"/>
+        </w:rPr>
+        <w:t>Lets</w:t>
+      </w:r>
+      <w:proofErr w:type="spellEnd"/>
+      <w:proofErr w:type="gramEnd"/>
+      <w:r>
+        <w:rPr>
+          <w:sz w:val="28"/>
+          <w:szCs w:val="28"/>
+        </w:rPr>
+        <w:t xml:space="preserve"> view it in S3 </w:t>
       </w:r>
     </w:p>
     <w:p/>

</xml_diff>

<commit_message>
We used Pyspark for data conversion to silver layer and uploaded to S3 and also verified it too
</commit_message>
<xml_diff>
--- a/Pyspark with S3 Project Covid data transform bronze, silver, gold.docx
+++ b/Pyspark with S3 Project Covid data transform bronze, silver, gold.docx
@@ -745,6 +745,333 @@
       </w:r>
     </w:p>
     <w:p/>
+    <w:p>
+      <w:pPr>
+        <w:rPr>
+          <w:sz w:val="28"/>
+          <w:szCs w:val="28"/>
+        </w:rPr>
+      </w:pPr>
+      <w:r>
+        <w:rPr>
+          <w:noProof/>
+          <w:sz w:val="28"/>
+          <w:szCs w:val="28"/>
+        </w:rPr>
+        <w:lastRenderedPageBreak/>
+        <w:drawing>
+          <wp:inline distT="0" distB="0" distL="0" distR="0" wp14:anchorId="55EF9F85" wp14:editId="64C7889B">
+            <wp:extent cx="5943600" cy="5323840"/>
+            <wp:effectExtent l="0" t="0" r="0" b="0"/>
+            <wp:docPr id="1968713323" name="Picture 4"/>
+            <wp:cNvGraphicFramePr>
+              <a:graphicFrameLocks xmlns:a="http://schemas.openxmlformats.org/drawingml/2006/main" noChangeAspect="1"/>
+            </wp:cNvGraphicFramePr>
+            <a:graphic xmlns:a="http://schemas.openxmlformats.org/drawingml/2006/main">
+              <a:graphicData uri="http://schemas.openxmlformats.org/drawingml/2006/picture">
+                <pic:pic xmlns:pic="http://schemas.openxmlformats.org/drawingml/2006/picture">
+                  <pic:nvPicPr>
+                    <pic:cNvPr id="0" name="Picture 7"/>
+                    <pic:cNvPicPr>
+                      <a:picLocks noChangeAspect="1" noChangeArrowheads="1"/>
+                    </pic:cNvPicPr>
+                  </pic:nvPicPr>
+                  <pic:blipFill>
+                    <a:blip r:embed="rId7">
+                      <a:extLst>
+                        <a:ext uri="{28A0092B-C50C-407E-A947-70E740481C1C}">
+                          <a14:useLocalDpi xmlns:a14="http://schemas.microsoft.com/office/drawing/2010/main" val="0"/>
+                        </a:ext>
+                      </a:extLst>
+                    </a:blip>
+                    <a:srcRect/>
+                    <a:stretch>
+                      <a:fillRect/>
+                    </a:stretch>
+                  </pic:blipFill>
+                  <pic:spPr bwMode="auto">
+                    <a:xfrm>
+                      <a:off x="0" y="0"/>
+                      <a:ext cx="5943600" cy="5323840"/>
+                    </a:xfrm>
+                    <a:prstGeom prst="rect">
+                      <a:avLst/>
+                    </a:prstGeom>
+                    <a:noFill/>
+                    <a:ln>
+                      <a:noFill/>
+                    </a:ln>
+                  </pic:spPr>
+                </pic:pic>
+              </a:graphicData>
+            </a:graphic>
+          </wp:inline>
+        </w:drawing>
+      </w:r>
+    </w:p>
+    <w:p>
+      <w:pPr>
+        <w:rPr>
+          <w:b/>
+          <w:bCs/>
+          <w:sz w:val="28"/>
+          <w:szCs w:val="28"/>
+        </w:rPr>
+      </w:pPr>
+    </w:p>
+    <w:p>
+      <w:pPr>
+        <w:rPr>
+          <w:b/>
+          <w:bCs/>
+          <w:sz w:val="28"/>
+          <w:szCs w:val="28"/>
+        </w:rPr>
+      </w:pPr>
+      <w:r>
+        <w:rPr>
+          <w:b/>
+          <w:bCs/>
+          <w:sz w:val="28"/>
+          <w:szCs w:val="28"/>
+        </w:rPr>
+        <w:t xml:space="preserve">Now </w:t>
+      </w:r>
+      <w:proofErr w:type="spellStart"/>
+      <w:proofErr w:type="gramStart"/>
+      <w:r>
+        <w:rPr>
+          <w:b/>
+          <w:bCs/>
+          <w:sz w:val="28"/>
+          <w:szCs w:val="28"/>
+        </w:rPr>
+        <w:t>Lets</w:t>
+      </w:r>
+      <w:proofErr w:type="spellEnd"/>
+      <w:proofErr w:type="gramEnd"/>
+      <w:r>
+        <w:rPr>
+          <w:b/>
+          <w:bCs/>
+          <w:sz w:val="28"/>
+          <w:szCs w:val="28"/>
+        </w:rPr>
+        <w:t xml:space="preserve"> move back to S3 to view the </w:t>
+      </w:r>
+      <w:proofErr w:type="gramStart"/>
+      <w:r>
+        <w:rPr>
+          <w:b/>
+          <w:bCs/>
+          <w:sz w:val="28"/>
+          <w:szCs w:val="28"/>
+        </w:rPr>
+        <w:t>Silver</w:t>
+      </w:r>
+      <w:proofErr w:type="gramEnd"/>
+      <w:r>
+        <w:rPr>
+          <w:b/>
+          <w:bCs/>
+          <w:sz w:val="28"/>
+          <w:szCs w:val="28"/>
+        </w:rPr>
+        <w:t xml:space="preserve"> layer data in </w:t>
+      </w:r>
+      <w:proofErr w:type="spellStart"/>
+      <w:r>
+        <w:rPr>
+          <w:b/>
+          <w:bCs/>
+          <w:sz w:val="28"/>
+          <w:szCs w:val="28"/>
+        </w:rPr>
+        <w:t>parque</w:t>
+      </w:r>
+      <w:proofErr w:type="spellEnd"/>
+      <w:r>
+        <w:rPr>
+          <w:b/>
+          <w:bCs/>
+          <w:sz w:val="28"/>
+          <w:szCs w:val="28"/>
+        </w:rPr>
+        <w:t xml:space="preserve"> format </w:t>
+      </w:r>
+    </w:p>
+    <w:p>
+      <w:pPr>
+        <w:pStyle w:val="ListParagraph"/>
+        <w:numPr>
+          <w:ilvl w:val="0"/>
+          <w:numId w:val="4"/>
+        </w:numPr>
+      </w:pPr>
+      <w:r>
+        <w:t xml:space="preserve">In </w:t>
+      </w:r>
+      <w:r>
+        <w:t>my</w:t>
+      </w:r>
+      <w:r>
+        <w:t xml:space="preserve"> bucket, </w:t>
+      </w:r>
+      <w:proofErr w:type="spellStart"/>
+      <w:r>
+        <w:t>navigate</w:t>
+      </w:r>
+      <w:r>
+        <w:t>ed</w:t>
+      </w:r>
+      <w:proofErr w:type="spellEnd"/>
+      <w:r>
+        <w:t xml:space="preserve"> to covid/silver-layer/.</w:t>
+      </w:r>
+    </w:p>
+    <w:p>
+      <w:pPr>
+        <w:pStyle w:val="ListParagraph"/>
+        <w:numPr>
+          <w:ilvl w:val="0"/>
+          <w:numId w:val="4"/>
+        </w:numPr>
+      </w:pPr>
+      <w:r>
+        <w:t>Capture</w:t>
+      </w:r>
+      <w:r>
+        <w:t>d</w:t>
+      </w:r>
+      <w:r>
+        <w:t xml:space="preserve"> the three folders:</w:t>
+      </w:r>
+    </w:p>
+    <w:p>
+      <w:pPr>
+        <w:numPr>
+          <w:ilvl w:val="0"/>
+          <w:numId w:val="3"/>
+        </w:numPr>
+      </w:pPr>
+      <w:proofErr w:type="spellStart"/>
+      <w:r>
+        <w:t>nytimes</w:t>
+      </w:r>
+      <w:proofErr w:type="spellEnd"/>
+      <w:r>
+        <w:t>/</w:t>
+      </w:r>
+      <w:proofErr w:type="spellStart"/>
+      <w:r>
+        <w:t>us_states</w:t>
+      </w:r>
+      <w:proofErr w:type="spellEnd"/>
+      <w:r>
+        <w:t>/</w:t>
+      </w:r>
+    </w:p>
+    <w:p>
+      <w:pPr>
+        <w:numPr>
+          <w:ilvl w:val="0"/>
+          <w:numId w:val="3"/>
+        </w:numPr>
+      </w:pPr>
+      <w:proofErr w:type="spellStart"/>
+      <w:r>
+        <w:t>covid_tracking</w:t>
+      </w:r>
+      <w:proofErr w:type="spellEnd"/>
+      <w:r>
+        <w:t>/</w:t>
+      </w:r>
+      <w:proofErr w:type="spellStart"/>
+      <w:r>
+        <w:t>states_daily</w:t>
+      </w:r>
+      <w:proofErr w:type="spellEnd"/>
+      <w:r>
+        <w:t>/</w:t>
+      </w:r>
+    </w:p>
+    <w:p>
+      <w:pPr>
+        <w:numPr>
+          <w:ilvl w:val="0"/>
+          <w:numId w:val="3"/>
+        </w:numPr>
+      </w:pPr>
+      <w:r>
+        <w:t>static/</w:t>
+      </w:r>
+      <w:proofErr w:type="spellStart"/>
+      <w:r>
+        <w:t>states_abv</w:t>
+      </w:r>
+      <w:proofErr w:type="spellEnd"/>
+      <w:r>
+        <w:t>/</w:t>
+      </w:r>
+    </w:p>
+    <w:p/>
+    <w:p>
+      <w:r>
+        <w:rPr>
+          <w:noProof/>
+        </w:rPr>
+        <w:lastRenderedPageBreak/>
+        <w:drawing>
+          <wp:inline distT="0" distB="0" distL="0" distR="0" wp14:anchorId="55D09399" wp14:editId="3DBB46FF">
+            <wp:extent cx="5943600" cy="2586990"/>
+            <wp:effectExtent l="0" t="0" r="0" b="3810"/>
+            <wp:docPr id="149200509" name="Picture 2"/>
+            <wp:cNvGraphicFramePr>
+              <a:graphicFrameLocks xmlns:a="http://schemas.openxmlformats.org/drawingml/2006/main" noChangeAspect="1"/>
+            </wp:cNvGraphicFramePr>
+            <a:graphic xmlns:a="http://schemas.openxmlformats.org/drawingml/2006/main">
+              <a:graphicData uri="http://schemas.openxmlformats.org/drawingml/2006/picture">
+                <pic:pic xmlns:pic="http://schemas.openxmlformats.org/drawingml/2006/picture">
+                  <pic:nvPicPr>
+                    <pic:cNvPr id="0" name="Picture 3"/>
+                    <pic:cNvPicPr>
+                      <a:picLocks noChangeAspect="1" noChangeArrowheads="1"/>
+                    </pic:cNvPicPr>
+                  </pic:nvPicPr>
+                  <pic:blipFill>
+                    <a:blip r:embed="rId8" cstate="print">
+                      <a:extLst>
+                        <a:ext uri="{28A0092B-C50C-407E-A947-70E740481C1C}">
+                          <a14:useLocalDpi xmlns:a14="http://schemas.microsoft.com/office/drawing/2010/main" val="0"/>
+                        </a:ext>
+                      </a:extLst>
+                    </a:blip>
+                    <a:srcRect/>
+                    <a:stretch>
+                      <a:fillRect/>
+                    </a:stretch>
+                  </pic:blipFill>
+                  <pic:spPr bwMode="auto">
+                    <a:xfrm>
+                      <a:off x="0" y="0"/>
+                      <a:ext cx="5943600" cy="2586990"/>
+                    </a:xfrm>
+                    <a:prstGeom prst="rect">
+                      <a:avLst/>
+                    </a:prstGeom>
+                    <a:noFill/>
+                    <a:ln>
+                      <a:noFill/>
+                    </a:ln>
+                  </pic:spPr>
+                </pic:pic>
+              </a:graphicData>
+            </a:graphic>
+          </wp:inline>
+        </w:drawing>
+      </w:r>
+    </w:p>
+    <w:p/>
     <w:sectPr>
       <w:pgSz w:w="12240" w:h="15840"/>
       <w:pgMar w:top="1440" w:right="1440" w:bottom="1440" w:left="1440" w:header="720" w:footer="720" w:gutter="0"/>
@@ -907,6 +1234,244 @@
     </w:lvl>
   </w:abstractNum>
   <w:abstractNum w:abstractNumId="1" w15:restartNumberingAfterBreak="0">
+    <w:nsid w:val="275B766C"/>
+    <w:multiLevelType w:val="multilevel"/>
+    <w:tmpl w:val="C11019FA"/>
+    <w:lvl w:ilvl="0">
+      <w:start w:val="1"/>
+      <w:numFmt w:val="bullet"/>
+      <w:lvlText w:val=""/>
+      <w:lvlJc w:val="left"/>
+      <w:pPr>
+        <w:tabs>
+          <w:tab w:val="num" w:pos="720"/>
+        </w:tabs>
+        <w:ind w:left="720" w:hanging="360"/>
+      </w:pPr>
+      <w:rPr>
+        <w:rFonts w:ascii="Symbol" w:hAnsi="Symbol" w:hint="default"/>
+        <w:sz w:val="20"/>
+      </w:rPr>
+    </w:lvl>
+    <w:lvl w:ilvl="1" w:tentative="1">
+      <w:start w:val="1"/>
+      <w:numFmt w:val="bullet"/>
+      <w:lvlText w:val="o"/>
+      <w:lvlJc w:val="left"/>
+      <w:pPr>
+        <w:tabs>
+          <w:tab w:val="num" w:pos="1440"/>
+        </w:tabs>
+        <w:ind w:left="1440" w:hanging="360"/>
+      </w:pPr>
+      <w:rPr>
+        <w:rFonts w:ascii="Courier New" w:hAnsi="Courier New" w:hint="default"/>
+        <w:sz w:val="20"/>
+      </w:rPr>
+    </w:lvl>
+    <w:lvl w:ilvl="2" w:tentative="1">
+      <w:start w:val="1"/>
+      <w:numFmt w:val="bullet"/>
+      <w:lvlText w:val=""/>
+      <w:lvlJc w:val="left"/>
+      <w:pPr>
+        <w:tabs>
+          <w:tab w:val="num" w:pos="2160"/>
+        </w:tabs>
+        <w:ind w:left="2160" w:hanging="360"/>
+      </w:pPr>
+      <w:rPr>
+        <w:rFonts w:ascii="Wingdings" w:hAnsi="Wingdings" w:hint="default"/>
+        <w:sz w:val="20"/>
+      </w:rPr>
+    </w:lvl>
+    <w:lvl w:ilvl="3" w:tentative="1">
+      <w:start w:val="1"/>
+      <w:numFmt w:val="bullet"/>
+      <w:lvlText w:val=""/>
+      <w:lvlJc w:val="left"/>
+      <w:pPr>
+        <w:tabs>
+          <w:tab w:val="num" w:pos="2880"/>
+        </w:tabs>
+        <w:ind w:left="2880" w:hanging="360"/>
+      </w:pPr>
+      <w:rPr>
+        <w:rFonts w:ascii="Wingdings" w:hAnsi="Wingdings" w:hint="default"/>
+        <w:sz w:val="20"/>
+      </w:rPr>
+    </w:lvl>
+    <w:lvl w:ilvl="4" w:tentative="1">
+      <w:start w:val="1"/>
+      <w:numFmt w:val="bullet"/>
+      <w:lvlText w:val=""/>
+      <w:lvlJc w:val="left"/>
+      <w:pPr>
+        <w:tabs>
+          <w:tab w:val="num" w:pos="3600"/>
+        </w:tabs>
+        <w:ind w:left="3600" w:hanging="360"/>
+      </w:pPr>
+      <w:rPr>
+        <w:rFonts w:ascii="Wingdings" w:hAnsi="Wingdings" w:hint="default"/>
+        <w:sz w:val="20"/>
+      </w:rPr>
+    </w:lvl>
+    <w:lvl w:ilvl="5" w:tentative="1">
+      <w:start w:val="1"/>
+      <w:numFmt w:val="bullet"/>
+      <w:lvlText w:val=""/>
+      <w:lvlJc w:val="left"/>
+      <w:pPr>
+        <w:tabs>
+          <w:tab w:val="num" w:pos="4320"/>
+        </w:tabs>
+        <w:ind w:left="4320" w:hanging="360"/>
+      </w:pPr>
+      <w:rPr>
+        <w:rFonts w:ascii="Wingdings" w:hAnsi="Wingdings" w:hint="default"/>
+        <w:sz w:val="20"/>
+      </w:rPr>
+    </w:lvl>
+    <w:lvl w:ilvl="6" w:tentative="1">
+      <w:start w:val="1"/>
+      <w:numFmt w:val="bullet"/>
+      <w:lvlText w:val=""/>
+      <w:lvlJc w:val="left"/>
+      <w:pPr>
+        <w:tabs>
+          <w:tab w:val="num" w:pos="5040"/>
+        </w:tabs>
+        <w:ind w:left="5040" w:hanging="360"/>
+      </w:pPr>
+      <w:rPr>
+        <w:rFonts w:ascii="Wingdings" w:hAnsi="Wingdings" w:hint="default"/>
+        <w:sz w:val="20"/>
+      </w:rPr>
+    </w:lvl>
+    <w:lvl w:ilvl="7" w:tentative="1">
+      <w:start w:val="1"/>
+      <w:numFmt w:val="bullet"/>
+      <w:lvlText w:val=""/>
+      <w:lvlJc w:val="left"/>
+      <w:pPr>
+        <w:tabs>
+          <w:tab w:val="num" w:pos="5760"/>
+        </w:tabs>
+        <w:ind w:left="5760" w:hanging="360"/>
+      </w:pPr>
+      <w:rPr>
+        <w:rFonts w:ascii="Wingdings" w:hAnsi="Wingdings" w:hint="default"/>
+        <w:sz w:val="20"/>
+      </w:rPr>
+    </w:lvl>
+    <w:lvl w:ilvl="8" w:tentative="1">
+      <w:start w:val="1"/>
+      <w:numFmt w:val="bullet"/>
+      <w:lvlText w:val=""/>
+      <w:lvlJc w:val="left"/>
+      <w:pPr>
+        <w:tabs>
+          <w:tab w:val="num" w:pos="6480"/>
+        </w:tabs>
+        <w:ind w:left="6480" w:hanging="360"/>
+      </w:pPr>
+      <w:rPr>
+        <w:rFonts w:ascii="Wingdings" w:hAnsi="Wingdings" w:hint="default"/>
+        <w:sz w:val="20"/>
+      </w:rPr>
+    </w:lvl>
+  </w:abstractNum>
+  <w:abstractNum w:abstractNumId="2" w15:restartNumberingAfterBreak="0">
+    <w:nsid w:val="6E534765"/>
+    <w:multiLevelType w:val="hybridMultilevel"/>
+    <w:tmpl w:val="3A2E487A"/>
+    <w:lvl w:ilvl="0" w:tplc="04090017">
+      <w:start w:val="1"/>
+      <w:numFmt w:val="lowerLetter"/>
+      <w:lvlText w:val="%1)"/>
+      <w:lvlJc w:val="left"/>
+      <w:pPr>
+        <w:ind w:left="720" w:hanging="360"/>
+      </w:pPr>
+      <w:rPr>
+        <w:rFonts w:hint="default"/>
+      </w:rPr>
+    </w:lvl>
+    <w:lvl w:ilvl="1" w:tplc="04090019" w:tentative="1">
+      <w:start w:val="1"/>
+      <w:numFmt w:val="lowerLetter"/>
+      <w:lvlText w:val="%2."/>
+      <w:lvlJc w:val="left"/>
+      <w:pPr>
+        <w:ind w:left="1440" w:hanging="360"/>
+      </w:pPr>
+    </w:lvl>
+    <w:lvl w:ilvl="2" w:tplc="0409001B" w:tentative="1">
+      <w:start w:val="1"/>
+      <w:numFmt w:val="lowerRoman"/>
+      <w:lvlText w:val="%3."/>
+      <w:lvlJc w:val="right"/>
+      <w:pPr>
+        <w:ind w:left="2160" w:hanging="180"/>
+      </w:pPr>
+    </w:lvl>
+    <w:lvl w:ilvl="3" w:tplc="0409000F" w:tentative="1">
+      <w:start w:val="1"/>
+      <w:numFmt w:val="decimal"/>
+      <w:lvlText w:val="%4."/>
+      <w:lvlJc w:val="left"/>
+      <w:pPr>
+        <w:ind w:left="2880" w:hanging="360"/>
+      </w:pPr>
+    </w:lvl>
+    <w:lvl w:ilvl="4" w:tplc="04090019" w:tentative="1">
+      <w:start w:val="1"/>
+      <w:numFmt w:val="lowerLetter"/>
+      <w:lvlText w:val="%5."/>
+      <w:lvlJc w:val="left"/>
+      <w:pPr>
+        <w:ind w:left="3600" w:hanging="360"/>
+      </w:pPr>
+    </w:lvl>
+    <w:lvl w:ilvl="5" w:tplc="0409001B" w:tentative="1">
+      <w:start w:val="1"/>
+      <w:numFmt w:val="lowerRoman"/>
+      <w:lvlText w:val="%6."/>
+      <w:lvlJc w:val="right"/>
+      <w:pPr>
+        <w:ind w:left="4320" w:hanging="180"/>
+      </w:pPr>
+    </w:lvl>
+    <w:lvl w:ilvl="6" w:tplc="0409000F" w:tentative="1">
+      <w:start w:val="1"/>
+      <w:numFmt w:val="decimal"/>
+      <w:lvlText w:val="%7."/>
+      <w:lvlJc w:val="left"/>
+      <w:pPr>
+        <w:ind w:left="5040" w:hanging="360"/>
+      </w:pPr>
+    </w:lvl>
+    <w:lvl w:ilvl="7" w:tplc="04090019" w:tentative="1">
+      <w:start w:val="1"/>
+      <w:numFmt w:val="lowerLetter"/>
+      <w:lvlText w:val="%8."/>
+      <w:lvlJc w:val="left"/>
+      <w:pPr>
+        <w:ind w:left="5760" w:hanging="360"/>
+      </w:pPr>
+    </w:lvl>
+    <w:lvl w:ilvl="8" w:tplc="0409001B" w:tentative="1">
+      <w:start w:val="1"/>
+      <w:numFmt w:val="lowerRoman"/>
+      <w:lvlText w:val="%9."/>
+      <w:lvlJc w:val="right"/>
+      <w:pPr>
+        <w:ind w:left="6480" w:hanging="180"/>
+      </w:pPr>
+    </w:lvl>
+  </w:abstractNum>
+  <w:abstractNum w:abstractNumId="3" w15:restartNumberingAfterBreak="0">
     <w:nsid w:val="7F635DCF"/>
     <w:multiLevelType w:val="hybridMultilevel"/>
     <w:tmpl w:val="0CB6E00C"/>
@@ -999,7 +1564,13 @@
     <w:abstractNumId w:val="0"/>
   </w:num>
   <w:num w:numId="2" w16cid:durableId="1094979521">
+    <w:abstractNumId w:val="3"/>
+  </w:num>
+  <w:num w:numId="3" w16cid:durableId="1834639925">
     <w:abstractNumId w:val="1"/>
+  </w:num>
+  <w:num w:numId="4" w16cid:durableId="618686684">
+    <w:abstractNumId w:val="2"/>
   </w:num>
 </w:numbering>
 </file>

</xml_diff>

<commit_message>
Final Step-Gold layer analytics
</commit_message>
<xml_diff>
--- a/Pyspark with S3 Project Covid data transform bronze, silver, gold.docx
+++ b/Pyspark with S3 Project Covid data transform bronze, silver, gold.docx
@@ -1069,6 +1069,146 @@
             </a:graphic>
           </wp:inline>
         </w:drawing>
+      </w:r>
+    </w:p>
+    <w:p/>
+    <w:p>
+      <w:pPr>
+        <w:rPr>
+          <w:b/>
+          <w:bCs/>
+          <w:sz w:val="28"/>
+          <w:szCs w:val="28"/>
+        </w:rPr>
+      </w:pPr>
+      <w:r>
+        <w:rPr>
+          <w:b/>
+          <w:bCs/>
+          <w:sz w:val="28"/>
+          <w:szCs w:val="28"/>
+        </w:rPr>
+        <w:t>Step</w:t>
+      </w:r>
+      <w:r>
+        <w:rPr>
+          <w:b/>
+          <w:bCs/>
+          <w:sz w:val="28"/>
+          <w:szCs w:val="28"/>
+        </w:rPr>
+        <w:t xml:space="preserve"> 3</w:t>
+      </w:r>
+      <w:proofErr w:type="gramStart"/>
+      <w:r>
+        <w:rPr>
+          <w:b/>
+          <w:bCs/>
+          <w:sz w:val="28"/>
+          <w:szCs w:val="28"/>
+        </w:rPr>
+        <w:t>:</w:t>
+      </w:r>
+      <w:r>
+        <w:rPr>
+          <w:b/>
+          <w:bCs/>
+          <w:sz w:val="28"/>
+          <w:szCs w:val="28"/>
+        </w:rPr>
+        <w:t xml:space="preserve">  Gold</w:t>
+      </w:r>
+      <w:proofErr w:type="gramEnd"/>
+      <w:r>
+        <w:rPr>
+          <w:b/>
+          <w:bCs/>
+          <w:sz w:val="28"/>
+          <w:szCs w:val="28"/>
+        </w:rPr>
+        <w:t xml:space="preserve"> layer analytics </w:t>
+      </w:r>
+    </w:p>
+    <w:p>
+      <w:r>
+        <w:t xml:space="preserve">First, defining the gold destination in my current </w:t>
+      </w:r>
+      <w:proofErr w:type="spellStart"/>
+      <w:r>
+        <w:t>Pyspark</w:t>
+      </w:r>
+      <w:proofErr w:type="spellEnd"/>
+    </w:p>
+    <w:p>
+      <w:r>
+        <w:t xml:space="preserve">Then </w:t>
+      </w:r>
+      <w:proofErr w:type="spellStart"/>
+      <w:r>
+        <w:t>cheking</w:t>
+      </w:r>
+      <w:proofErr w:type="spellEnd"/>
+      <w:r>
+        <w:t xml:space="preserve"> the column names by printing only the column names, not the rows of data. We need these names </w:t>
+      </w:r>
+      <w:r>
+        <w:t xml:space="preserve">to choose the correct join keys and avoid errors when creating the </w:t>
+      </w:r>
+      <w:proofErr w:type="gramStart"/>
+      <w:r>
+        <w:t>Gold</w:t>
+      </w:r>
+      <w:proofErr w:type="gramEnd"/>
+      <w:r>
+        <w:t xml:space="preserve"> dataset.</w:t>
+      </w:r>
+      <w:r>
+        <w:t xml:space="preserve"> </w:t>
+      </w:r>
+    </w:p>
+    <w:p>
+      <w:r>
+        <w:t xml:space="preserve">Next, </w:t>
+      </w:r>
+      <w:proofErr w:type="gramStart"/>
+      <w:r>
+        <w:t>preparing</w:t>
+      </w:r>
+      <w:proofErr w:type="gramEnd"/>
+      <w:r>
+        <w:t xml:space="preserve"> the dataset for joining ‘</w:t>
+      </w:r>
+      <w:proofErr w:type="spellStart"/>
+      <w:r>
+        <w:t>nytimes</w:t>
+      </w:r>
+      <w:proofErr w:type="spellEnd"/>
+      <w:r>
+        <w:t xml:space="preserve"> and ‘</w:t>
+      </w:r>
+      <w:proofErr w:type="spellStart"/>
+      <w:r>
+        <w:t>dailytracking</w:t>
+      </w:r>
+      <w:proofErr w:type="spellEnd"/>
+      <w:r>
+        <w:t xml:space="preserve">’ datasets on date and state then adding the state abbreviation. </w:t>
+      </w:r>
+    </w:p>
+    <w:p>
+      <w:r>
+        <w:t xml:space="preserve">What this creates: </w:t>
+      </w:r>
+      <w:r>
+        <w:t>One analytics dataset combining reported cases and deaths from NYTimes with testing, hospitalization, and recovery metrics from the daily tracking data, plus state abbreviations.</w:t>
+      </w:r>
+      <w:r>
+        <w:t xml:space="preserve"> </w:t>
+      </w:r>
+    </w:p>
+    <w:p>
+      <w:r>
+        <w:t>The join keeps every NYTimes row even if a matching daily tracking record is unavailable. The final deduplication retains one row per date and state.</w:t>
       </w:r>
     </w:p>
     <w:p/>

</xml_diff>

<commit_message>
Gold data transform in pyspark overall code screenshot and overwrite the files to S3
</commit_message>
<xml_diff>
--- a/Pyspark with S3 Project Covid data transform bronze, silver, gold.docx
+++ b/Pyspark with S3 Project Covid data transform bronze, silver, gold.docx
@@ -1209,6 +1209,63 @@
     <w:p>
       <w:r>
         <w:t>The join keeps every NYTimes row even if a matching daily tracking record is unavailable. The final deduplication retains one row per date and state.</w:t>
+      </w:r>
+    </w:p>
+    <w:p/>
+    <w:p>
+      <w:r>
+        <w:rPr>
+          <w:noProof/>
+        </w:rPr>
+        <w:lastRenderedPageBreak/>
+        <w:drawing>
+          <wp:inline distT="0" distB="0" distL="0" distR="0" wp14:anchorId="0A5952C8" wp14:editId="3E89B0A5">
+            <wp:extent cx="5943600" cy="3153410"/>
+            <wp:effectExtent l="0" t="0" r="0" b="8890"/>
+            <wp:docPr id="873917959" name="Picture 2"/>
+            <wp:cNvGraphicFramePr>
+              <a:graphicFrameLocks xmlns:a="http://schemas.openxmlformats.org/drawingml/2006/main" noChangeAspect="1"/>
+            </wp:cNvGraphicFramePr>
+            <a:graphic xmlns:a="http://schemas.openxmlformats.org/drawingml/2006/main">
+              <a:graphicData uri="http://schemas.openxmlformats.org/drawingml/2006/picture">
+                <pic:pic xmlns:pic="http://schemas.openxmlformats.org/drawingml/2006/picture">
+                  <pic:nvPicPr>
+                    <pic:cNvPr id="0" name="Picture 3"/>
+                    <pic:cNvPicPr>
+                      <a:picLocks noChangeAspect="1" noChangeArrowheads="1"/>
+                    </pic:cNvPicPr>
+                  </pic:nvPicPr>
+                  <pic:blipFill>
+                    <a:blip r:embed="rId9" cstate="print">
+                      <a:extLst>
+                        <a:ext uri="{28A0092B-C50C-407E-A947-70E740481C1C}">
+                          <a14:useLocalDpi xmlns:a14="http://schemas.microsoft.com/office/drawing/2010/main" val="0"/>
+                        </a:ext>
+                      </a:extLst>
+                    </a:blip>
+                    <a:srcRect/>
+                    <a:stretch>
+                      <a:fillRect/>
+                    </a:stretch>
+                  </pic:blipFill>
+                  <pic:spPr bwMode="auto">
+                    <a:xfrm>
+                      <a:off x="0" y="0"/>
+                      <a:ext cx="5943600" cy="3153410"/>
+                    </a:xfrm>
+                    <a:prstGeom prst="rect">
+                      <a:avLst/>
+                    </a:prstGeom>
+                    <a:noFill/>
+                    <a:ln>
+                      <a:noFill/>
+                    </a:ln>
+                  </pic:spPr>
+                </pic:pic>
+              </a:graphicData>
+            </a:graphic>
+          </wp:inline>
+        </w:drawing>
       </w:r>
     </w:p>
     <w:p/>

</xml_diff>

<commit_message>
viewing the data via S3 that we uploaded from pyspark with SS
</commit_message>
<xml_diff>
--- a/Pyspark with S3 Project Covid data transform bronze, silver, gold.docx
+++ b/Pyspark with S3 Project Covid data transform bronze, silver, gold.docx
@@ -1269,6 +1269,147 @@
       </w:r>
     </w:p>
     <w:p/>
+    <w:p>
+      <w:r>
+        <w:t xml:space="preserve">Finally, gold </w:t>
+      </w:r>
+      <w:proofErr w:type="spellStart"/>
+      <w:r>
+        <w:t>dataframe</w:t>
+      </w:r>
+      <w:proofErr w:type="spellEnd"/>
+      <w:r>
+        <w:t xml:space="preserve"> is created </w:t>
+      </w:r>
+      <w:r>
+        <w:t>Now we’ll save</w:t>
+      </w:r>
+      <w:r>
+        <w:t>/upload</w:t>
+      </w:r>
+      <w:r>
+        <w:t xml:space="preserve"> it to S3 in Parquet forma</w:t>
+      </w:r>
+      <w:r>
+        <w:t>t using this command</w:t>
+      </w:r>
+    </w:p>
+    <w:p>
+      <w:proofErr w:type="spellStart"/>
+      <w:r>
+        <w:t>gold_</w:t>
+      </w:r>
+      <w:proofErr w:type="gramStart"/>
+      <w:r>
+        <w:t>df.write</w:t>
+      </w:r>
+      <w:proofErr w:type="gramEnd"/>
+      <w:r>
+        <w:t>.mode</w:t>
+      </w:r>
+      <w:proofErr w:type="spellEnd"/>
+      <w:r>
+        <w:t>("overwrite"</w:t>
+      </w:r>
+      <w:proofErr w:type="gramStart"/>
+      <w:r>
+        <w:t>).parquet</w:t>
+      </w:r>
+      <w:proofErr w:type="gramEnd"/>
+      <w:r>
+        <w:t>(</w:t>
+      </w:r>
+    </w:p>
+    <w:p>
+      <w:r>
+        <w:t xml:space="preserve">    </w:t>
+      </w:r>
+      <w:proofErr w:type="gramStart"/>
+      <w:r>
+        <w:t>f"{GOLD}/</w:t>
+      </w:r>
+      <w:proofErr w:type="spellStart"/>
+      <w:proofErr w:type="gramEnd"/>
+      <w:r>
+        <w:t>covid_analytics</w:t>
+      </w:r>
+      <w:proofErr w:type="spellEnd"/>
+      <w:r>
+        <w:t>"</w:t>
+      </w:r>
+    </w:p>
+    <w:p>
+      <w:r>
+        <w:t>)</w:t>
+      </w:r>
+    </w:p>
+    <w:p>
+      <w:proofErr w:type="spellStart"/>
+      <w:proofErr w:type="gramStart"/>
+      <w:r>
+        <w:t>Lets</w:t>
+      </w:r>
+      <w:proofErr w:type="spellEnd"/>
+      <w:proofErr w:type="gramEnd"/>
+      <w:r>
+        <w:t xml:space="preserve"> view it from S3 </w:t>
+      </w:r>
+    </w:p>
+    <w:p>
+      <w:r>
+        <w:rPr>
+          <w:noProof/>
+        </w:rPr>
+        <w:drawing>
+          <wp:inline distT="0" distB="0" distL="0" distR="0" wp14:anchorId="4D3BD23B" wp14:editId="0AFD0026">
+            <wp:extent cx="5943600" cy="2439670"/>
+            <wp:effectExtent l="0" t="0" r="0" b="0"/>
+            <wp:docPr id="924435287" name="Picture 1"/>
+            <wp:cNvGraphicFramePr>
+              <a:graphicFrameLocks xmlns:a="http://schemas.openxmlformats.org/drawingml/2006/main" noChangeAspect="1"/>
+            </wp:cNvGraphicFramePr>
+            <a:graphic xmlns:a="http://schemas.openxmlformats.org/drawingml/2006/main">
+              <a:graphicData uri="http://schemas.openxmlformats.org/drawingml/2006/picture">
+                <pic:pic xmlns:pic="http://schemas.openxmlformats.org/drawingml/2006/picture">
+                  <pic:nvPicPr>
+                    <pic:cNvPr id="0" name="Picture 1"/>
+                    <pic:cNvPicPr>
+                      <a:picLocks noChangeAspect="1" noChangeArrowheads="1"/>
+                    </pic:cNvPicPr>
+                  </pic:nvPicPr>
+                  <pic:blipFill>
+                    <a:blip r:embed="rId10" cstate="print">
+                      <a:extLst>
+                        <a:ext uri="{28A0092B-C50C-407E-A947-70E740481C1C}">
+                          <a14:useLocalDpi xmlns:a14="http://schemas.microsoft.com/office/drawing/2010/main" val="0"/>
+                        </a:ext>
+                      </a:extLst>
+                    </a:blip>
+                    <a:srcRect/>
+                    <a:stretch>
+                      <a:fillRect/>
+                    </a:stretch>
+                  </pic:blipFill>
+                  <pic:spPr bwMode="auto">
+                    <a:xfrm>
+                      <a:off x="0" y="0"/>
+                      <a:ext cx="5943600" cy="2439670"/>
+                    </a:xfrm>
+                    <a:prstGeom prst="rect">
+                      <a:avLst/>
+                    </a:prstGeom>
+                    <a:noFill/>
+                    <a:ln>
+                      <a:noFill/>
+                    </a:ln>
+                  </pic:spPr>
+                </pic:pic>
+              </a:graphicData>
+            </a:graphic>
+          </wp:inline>
+        </w:drawing>
+      </w:r>
+    </w:p>
     <w:sectPr>
       <w:pgSz w:w="12240" w:h="15840"/>
       <w:pgMar w:top="1440" w:right="1440" w:bottom="1440" w:left="1440" w:header="720" w:footer="720" w:gutter="0"/>

</xml_diff>

<commit_message>
overall conclusion or summary of the project section added
</commit_message>
<xml_diff>
--- a/Pyspark with S3 Project Covid data transform bronze, silver, gold.docx
+++ b/Pyspark with S3 Project Covid data transform bronze, silver, gold.docx
@@ -1410,6 +1410,70 @@
         </w:drawing>
       </w:r>
     </w:p>
+    <w:p/>
+    <w:p>
+      <w:pPr>
+        <w:rPr>
+          <w:b/>
+          <w:bCs/>
+        </w:rPr>
+      </w:pPr>
+      <w:r>
+        <w:rPr>
+          <w:b/>
+          <w:bCs/>
+        </w:rPr>
+        <w:lastRenderedPageBreak/>
+        <w:t xml:space="preserve">Project Conclusion: COVID-19 Data Pipeline Using AWS S3 and </w:t>
+      </w:r>
+      <w:proofErr w:type="spellStart"/>
+      <w:r>
+        <w:rPr>
+          <w:b/>
+          <w:bCs/>
+        </w:rPr>
+        <w:t>PySpark</w:t>
+      </w:r>
+      <w:proofErr w:type="spellEnd"/>
+    </w:p>
+    <w:p>
+      <w:r>
+        <w:t xml:space="preserve">This project focused on building a COVID-19 data pipeline using Amazon S3, </w:t>
+      </w:r>
+      <w:proofErr w:type="spellStart"/>
+      <w:r>
+        <w:t>PySpark</w:t>
+      </w:r>
+      <w:proofErr w:type="spellEnd"/>
+      <w:r>
+        <w:t xml:space="preserve">, and the Bronze, Silver, and Gold Medallion Architecture. Raw datasets from NYTimes, COVID Tracking, and state abbreviation sources were stored in the </w:t>
+      </w:r>
+      <w:proofErr w:type="gramStart"/>
+      <w:r>
+        <w:t>Bronze</w:t>
+      </w:r>
+      <w:proofErr w:type="gramEnd"/>
+      <w:r>
+        <w:t xml:space="preserve"> layer. In the Silver layer, </w:t>
+      </w:r>
+      <w:proofErr w:type="spellStart"/>
+      <w:r>
+        <w:t>PySpark</w:t>
+      </w:r>
+      <w:proofErr w:type="spellEnd"/>
+      <w:r>
+        <w:t xml:space="preserve"> was used to clean the data by removing extra whitespace and duplicate records, then </w:t>
+      </w:r>
+      <w:proofErr w:type="gramStart"/>
+      <w:r>
+        <w:t>convert</w:t>
+      </w:r>
+      <w:proofErr w:type="gramEnd"/>
+      <w:r>
+        <w:t xml:space="preserve"> the datasets into Parquet format.</w:t>
+      </w:r>
+    </w:p>
+    <w:p/>
     <w:sectPr>
       <w:pgSz w:w="12240" w:h="15840"/>
       <w:pgMar w:top="1440" w:right="1440" w:bottom="1440" w:left="1440" w:header="720" w:footer="720" w:gutter="0"/>
@@ -2517,7 +2581,6 @@
   <w:style w:type="character" w:default="1" w:styleId="DefaultParagraphFont">
     <w:name w:val="Default Paragraph Font"/>
     <w:uiPriority w:val="1"/>
-    <w:semiHidden/>
     <w:unhideWhenUsed/>
   </w:style>
   <w:style w:type="table" w:default="1" w:styleId="TableNormal">

</xml_diff>